<commit_message>
Update Term 1 Report - Ricky Nandhra - Final Year Project.docx
</commit_message>
<xml_diff>
--- a/CS3IPDocuments/Term 1 Report - Ricky Nandhra - Final Year Project.docx
+++ b/CS3IPDocuments/Term 1 Report - Ricky Nandhra - Final Year Project.docx
@@ -140,47 +140,23 @@
         <w:t xml:space="preserve"> behaviour well suited to tackle the Traveling Salesman Problem</w:t>
       </w:r>
       <w:r>
-        <w:t xml:space="preserve">, TSP is an ‘optimisation problem that is simple to state but very difficult to solve. </w:t>
-      </w:r>
-      <w:r>
-        <w:t>The</w:t>
+        <w:t>, TSP is an ‘optimisation problem that is simple to state but very difficult to solve. The problem is to find the shortest tour through a set of N vertices so that each vertex is visited exactly once. This problem is known to be NP-</w:t>
+      </w:r>
+      <w:r>
+        <w:t>hard and</w:t>
+      </w:r>
+      <w:r>
+        <w:t xml:space="preserve"> cannot be solved exactly in polynomial time’ – with more vertices, more places for the program to search</w:t>
+      </w:r>
+      <w:r>
+        <w:t>, the time to search every possible route gets so incomprehensively large that it is feasibly impossible to do so</w:t>
+      </w:r>
+      <w:r>
+        <w:t>.</w:t>
       </w:r>
       <w:r>
         <w:t xml:space="preserve"> </w:t>
       </w:r>
-      <w:r>
-        <w:t>problem is to find the shortest tour through a set of N</w:t>
-      </w:r>
-      <w:r>
-        <w:t xml:space="preserve"> </w:t>
-      </w:r>
-      <w:r>
-        <w:t>vertices so that each vertex is visited exactly once.</w:t>
-      </w:r>
-      <w:r>
-        <w:t xml:space="preserve"> </w:t>
-      </w:r>
-      <w:r>
-        <w:t>This problem is known to be NP-hard, and cannot be</w:t>
-      </w:r>
-      <w:r>
-        <w:t xml:space="preserve"> </w:t>
-      </w:r>
-      <w:r>
-        <w:t>solved exactly in polynomial time</w:t>
-      </w:r>
-      <w:r>
-        <w:t>’ – with more vertices, more places for the program to search</w:t>
-      </w:r>
-      <w:r>
-        <w:t>, the time to search every possible route gets so incomprehensively large that it is feasibly impossible to do so</w:t>
-      </w:r>
-      <w:r>
-        <w:t>.</w:t>
-      </w:r>
-      <w:r>
-        <w:t xml:space="preserve"> </w:t>
-      </w:r>
     </w:p>
     <w:p>
       <w:r>
@@ -190,13 +166,25 @@
         <w:t xml:space="preserve"> – a method to find near-optimal solutions</w:t>
       </w:r>
       <w:r>
-        <w:t>, but more generally ACO is finds the most efficient path through graph-like structures. ACO does this by mimicking ant colony behaviours. Ant</w:t>
+        <w:t xml:space="preserve">, but more generally ACO </w:t>
+      </w:r>
+      <w:r>
+        <w:t>finds</w:t>
+      </w:r>
+      <w:r>
+        <w:t xml:space="preserve"> the most efficient path through graph-like structures. ACO does this by mimicking ant colony behaviours. Ant</w:t>
       </w:r>
       <w:r>
         <w:t xml:space="preserve">s use specialised chemicals called pheromones, laying them down forms a path for other ants to follow. </w:t>
       </w:r>
       <w:r>
-        <w:t>These paths are then naturally refined as more and more ants use them, over time forming shorter pathways</w:t>
+        <w:t xml:space="preserve">These paths are then naturally refined as </w:t>
+      </w:r>
+      <w:r>
+        <w:t>more</w:t>
+      </w:r>
+      <w:r>
+        <w:t xml:space="preserve"> ants use them, over time forming shorter pathways</w:t>
       </w:r>
       <w:r>
         <w:t xml:space="preserve"> – improving the performance of the system over time. </w:t>
@@ -240,10 +228,13 @@
         <w:t>. While there are clear benefits to choosing Godot over Unity</w:t>
       </w:r>
       <w:r>
-        <w:t xml:space="preserve"> such as </w:t>
-      </w:r>
-      <w:r>
-        <w:t xml:space="preserve">, I chose Unity as it is seen more as an industry standard, and I wanted to develop those skills. </w:t>
+        <w:t xml:space="preserve"> such </w:t>
+      </w:r>
+      <w:r>
+        <w:t>as,</w:t>
+      </w:r>
+      <w:r>
+        <w:t xml:space="preserve"> I chose Unity as it is seen more as an industry standard, and I wanted to develop those skills. </w:t>
       </w:r>
     </w:p>
     <w:p>
@@ -321,7 +312,13 @@
     </w:p>
     <w:p>
       <w:r>
-        <w:t xml:space="preserve">One area of improvement would be the case of Mars rovers, there is an ‘upwards of 21-23 minutes’ delay for one-way communications to Mars, if it is on the opposite side of the Sun. Improving efficiencies of autonomous agents means that there is no need for humans to manually input commands. Effectively cutting out the middle-man, rovers can simply navigate for themselves and send their findings back to Earth. Ensuring that </w:t>
+        <w:t xml:space="preserve">One area of improvement would be the case of Mars rovers, there is an ‘upwards of 21-23 minutes’ delay for one-way communications to Mars, if it is on the opposite side of the Sun. Improving efficiencies of autonomous agents means that there is no need for humans to manually input commands. Effectively cutting out the </w:t>
+      </w:r>
+      <w:r>
+        <w:t>middleman</w:t>
+      </w:r>
+      <w:r>
+        <w:t xml:space="preserve">, rovers can simply navigate for themselves and send their findings back to Earth. Ensuring that </w:t>
       </w:r>
       <w:r>
         <w:t>NASA</w:t>
@@ -340,7 +337,249 @@
     </w:p>
     <w:p>
       <w:r>
-        <w:t xml:space="preserve">On designing the system I first have to look into ACO, </w:t>
+        <w:t>The primary objective of this project is to answer the research question above, as such my functional requirements include:</w:t>
+      </w:r>
+    </w:p>
+    <w:p>
+      <w:pPr>
+        <w:pStyle w:val="ListParagraph"/>
+        <w:numPr>
+          <w:ilvl w:val="0"/>
+          <w:numId w:val="6"/>
+        </w:numPr>
+      </w:pPr>
+      <w:r>
+        <w:t>Ants must be rendered</w:t>
+      </w:r>
+    </w:p>
+    <w:p>
+      <w:pPr>
+        <w:pStyle w:val="ListParagraph"/>
+        <w:numPr>
+          <w:ilvl w:val="0"/>
+          <w:numId w:val="6"/>
+        </w:numPr>
+      </w:pPr>
+      <w:r>
+        <w:t>Pheromones dropped and evaporated over time</w:t>
+      </w:r>
+    </w:p>
+    <w:p>
+      <w:pPr>
+        <w:pStyle w:val="ListParagraph"/>
+        <w:numPr>
+          <w:ilvl w:val="0"/>
+          <w:numId w:val="6"/>
+        </w:numPr>
+      </w:pPr>
+      <w:r>
+        <w:t>Ants must follow these pheromone trails, but still have randomness</w:t>
+      </w:r>
+    </w:p>
+    <w:p>
+      <w:pPr>
+        <w:pStyle w:val="ListParagraph"/>
+        <w:numPr>
+          <w:ilvl w:val="0"/>
+          <w:numId w:val="6"/>
+        </w:numPr>
+      </w:pPr>
+      <w:r>
+        <w:t>Over time, the ants must find their way to the goal – in this case food</w:t>
+      </w:r>
+    </w:p>
+    <w:p>
+      <w:pPr>
+        <w:pStyle w:val="ListParagraph"/>
+        <w:numPr>
+          <w:ilvl w:val="0"/>
+          <w:numId w:val="6"/>
+        </w:numPr>
+      </w:pPr>
+      <w:r>
+        <w:t>Ability to update the environment and environments</w:t>
+      </w:r>
+    </w:p>
+    <w:p>
+      <w:r>
+        <w:t>Non-functional requirements include:</w:t>
+      </w:r>
+    </w:p>
+    <w:p>
+      <w:pPr>
+        <w:pStyle w:val="ListParagraph"/>
+        <w:numPr>
+          <w:ilvl w:val="0"/>
+          <w:numId w:val="6"/>
+        </w:numPr>
+      </w:pPr>
+      <w:r>
+        <w:t>Efficient execution for thousands of ants</w:t>
+      </w:r>
+      <w:r>
+        <w:t xml:space="preserve"> – scalability</w:t>
+      </w:r>
+    </w:p>
+    <w:p/>
+    <w:p>
+      <w:r>
+        <w:t>Ants should only know a few things about the environment</w:t>
+      </w:r>
+    </w:p>
+    <w:p>
+      <w:pPr>
+        <w:pStyle w:val="ListParagraph"/>
+        <w:numPr>
+          <w:ilvl w:val="0"/>
+          <w:numId w:val="6"/>
+        </w:numPr>
+      </w:pPr>
+      <w:r>
+        <w:t>Which colony they belong to</w:t>
+      </w:r>
+    </w:p>
+    <w:p>
+      <w:pPr>
+        <w:pStyle w:val="ListParagraph"/>
+        <w:numPr>
+          <w:ilvl w:val="0"/>
+          <w:numId w:val="6"/>
+        </w:numPr>
+      </w:pPr>
+      <w:r>
+        <w:t>Where they are</w:t>
+      </w:r>
+    </w:p>
+    <w:p>
+      <w:pPr>
+        <w:pStyle w:val="ListParagraph"/>
+        <w:numPr>
+          <w:ilvl w:val="0"/>
+          <w:numId w:val="6"/>
+        </w:numPr>
+      </w:pPr>
+      <w:r>
+        <w:t>If they have food or not</w:t>
+      </w:r>
+    </w:p>
+    <w:p>
+      <w:r>
+        <w:t>Ants should also be able to</w:t>
+      </w:r>
+    </w:p>
+    <w:p>
+      <w:pPr>
+        <w:pStyle w:val="ListParagraph"/>
+        <w:numPr>
+          <w:ilvl w:val="0"/>
+          <w:numId w:val="6"/>
+        </w:numPr>
+      </w:pPr>
+      <w:r>
+        <w:t xml:space="preserve">Move around the environment with respect to walls and other obstacles </w:t>
+      </w:r>
+    </w:p>
+    <w:p>
+      <w:pPr>
+        <w:pStyle w:val="ListParagraph"/>
+        <w:numPr>
+          <w:ilvl w:val="0"/>
+          <w:numId w:val="6"/>
+        </w:numPr>
+      </w:pPr>
+      <w:r>
+        <w:t>Deposit pheromones and follow pheromone trails that belong to their colony</w:t>
+      </w:r>
+    </w:p>
+    <w:p>
+      <w:pPr>
+        <w:pStyle w:val="ListParagraph"/>
+        <w:numPr>
+          <w:ilvl w:val="0"/>
+          <w:numId w:val="6"/>
+        </w:numPr>
+      </w:pPr>
+      <w:r>
+        <w:t>See, pick up and deposit food</w:t>
+      </w:r>
+    </w:p>
+    <w:p>
+      <w:r>
+        <w:t xml:space="preserve">This basic set of </w:t>
+      </w:r>
+      <w:r>
+        <w:t>functionalities</w:t>
+      </w:r>
+      <w:r>
+        <w:t xml:space="preserve"> will be viable for me to create a minimum viable product and tune parameters that may need tuning, for example the pheromone evaporation rate. </w:t>
+      </w:r>
+    </w:p>
+    <w:p/>
+    <w:p>
+      <w:r>
+        <w:lastRenderedPageBreak/>
+        <w:t xml:space="preserve">My first prototype used Unity’s </w:t>
+      </w:r>
+      <w:proofErr w:type="spellStart"/>
+      <w:r>
+        <w:t>GameObjects</w:t>
+      </w:r>
+      <w:proofErr w:type="spellEnd"/>
+      <w:r>
+        <w:t xml:space="preserve"> to create the ants, this allowed me to render ants with ease so I could focus on the artificial intelligence side. I also decided to use </w:t>
+      </w:r>
+      <w:proofErr w:type="spellStart"/>
+      <w:r>
+        <w:t>GameObjects</w:t>
+      </w:r>
+      <w:proofErr w:type="spellEnd"/>
+      <w:r>
+        <w:t xml:space="preserve"> for the pheromones so I could easily see them. However, this leaded me into a slew of issues, for the ants to “see” the pheromones I had to use ray casting, every update cycle, every ant would check for any pheromones, food and other ants within its field of view. All these choices led to this prototype using lots of processing power, it wasn’t as scalable as I wanted it to be even though it met with every other requirement.</w:t>
+      </w:r>
+    </w:p>
+    <w:p>
+      <w:r>
+        <w:t xml:space="preserve">For my second prototype I researched into different methods within Unity that were more scalable. </w:t>
+      </w:r>
+      <w:r>
+        <w:t xml:space="preserve">Rather than using </w:t>
+      </w:r>
+      <w:proofErr w:type="spellStart"/>
+      <w:r>
+        <w:t>GameObjects</w:t>
+      </w:r>
+      <w:proofErr w:type="spellEnd"/>
+      <w:r>
+        <w:t xml:space="preserve">, I decided to store ants as data, they know their position, rotation, colony and if they are carrying food. This also needed to be able to render a sprite, to visualise the ants – which leaded me straight to meshes. As for pheromones I decided to split the search space available into a grid, ants would deposit the pheromones to the closest cell of that grid. More pheromones deposited means higher density pheromones, meaning ants are more likely to follow these trails. </w:t>
+      </w:r>
+    </w:p>
+    <w:p>
+      <w:r>
+        <w:t xml:space="preserve">This second version lost no functionality and was more scalable. Measured by the frames per second (FPS) during execution – the first prototype </w:t>
+      </w:r>
+      <w:r>
+        <w:t xml:space="preserve">simulated 100 ants, 1 colony and 1 food source (with additional </w:t>
+      </w:r>
+      <w:proofErr w:type="spellStart"/>
+      <w:r>
+        <w:t>GameObjects</w:t>
+      </w:r>
+      <w:proofErr w:type="spellEnd"/>
+      <w:r>
+        <w:t xml:space="preserve"> reserved for pheromones) and achieved on average 20FPS. The second prototype simulated 1,000 ants, 1 colony and 1 food source, using only 2 </w:t>
+      </w:r>
+      <w:proofErr w:type="spellStart"/>
+      <w:r>
+        <w:t>GameObjects</w:t>
+      </w:r>
+      <w:proofErr w:type="spellEnd"/>
+      <w:r>
+        <w:t xml:space="preserve"> and achieved on average 100FPS. On average, a 400% increase in performance. </w:t>
+      </w:r>
+    </w:p>
+    <w:p>
+      <w:r>
+        <w:t xml:space="preserve">However, there were a couple of pitfalls. The initial prototype was well-tuned with the initial values I had set, this second prototype, as I made the search space larger and the ants smaller, the values were seemingly off and as such I had to spend time testing which values worked best for various parameters. </w:t>
       </w:r>
     </w:p>
     <w:p>
@@ -414,19 +653,19 @@
           <w:rPr>
             <w:rStyle w:val="Hyperlink"/>
           </w:rPr>
-          <w:t>https://www.researchgate.net</w:t>
+          <w:t>https://www.researchgate.net/publication/308953</w:t>
         </w:r>
         <w:r>
           <w:rPr>
             <w:rStyle w:val="Hyperlink"/>
           </w:rPr>
-          <w:t>/</w:t>
+          <w:t>6</w:t>
         </w:r>
         <w:r>
           <w:rPr>
             <w:rStyle w:val="Hyperlink"/>
           </w:rPr>
-          <w:t>publication/308953674_Ant_Colony_Optimization</w:t>
+          <w:t>74_Ant_Colony_Optimization</w:t>
         </w:r>
       </w:hyperlink>
     </w:p>
@@ -470,19 +709,7 @@
           <w:rPr>
             <w:rStyle w:val="Hyperlink"/>
           </w:rPr>
-          <w:t>https://www.lpi.usra.edu/lunar/strategies/resources/M2M</w:t>
-        </w:r>
-        <w:r>
-          <w:rPr>
-            <w:rStyle w:val="Hyperlink"/>
-          </w:rPr>
-          <w:t>-</w:t>
-        </w:r>
-        <w:r>
-          <w:rPr>
-            <w:rStyle w:val="Hyperlink"/>
-          </w:rPr>
-          <w:t>ACR2023_MarsCommunicationDisruptionDelay.pdf</w:t>
+          <w:t>https://www.lpi.usra.edu/lunar/strategies/resources/M2M-ACR2023_MarsCommunicationDisruptionDelay.pdf</w:t>
         </w:r>
       </w:hyperlink>
       <w:r>
@@ -544,6 +771,230 @@
 <file path=word/numbering.xml><?xml version="1.0" encoding="utf-8"?>
 <w:numbering xmlns:wpc="http://schemas.microsoft.com/office/word/2010/wordprocessingCanvas" xmlns:cx="http://schemas.microsoft.com/office/drawing/2014/chartex" xmlns:cx1="http://schemas.microsoft.com/office/drawing/2015/9/8/chartex" xmlns:cx2="http://schemas.microsoft.com/office/drawing/2015/10/21/chartex" xmlns:cx3="http://schemas.microsoft.com/office/drawing/2016/5/9/chartex" xmlns:cx4="http://schemas.microsoft.com/office/drawing/2016/5/10/chartex" xmlns:cx5="http://schemas.microsoft.com/office/drawing/2016/5/11/chartex" xmlns:cx6="http://schemas.microsoft.com/office/drawing/2016/5/12/chartex" xmlns:cx7="http://schemas.microsoft.com/office/drawing/2016/5/13/chartex" xmlns:cx8="http://schemas.microsoft.com/office/drawing/2016/5/14/chartex" xmlns:mc="http://schemas.openxmlformats.org/markup-compatibility/2006" xmlns:aink="http://schemas.microsoft.com/office/drawing/2016/ink" xmlns:am3d="http://schemas.microsoft.com/office/drawing/2017/model3d" xmlns:o="urn:schemas-microsoft-com:office:office" xmlns:oel="http://schemas.microsoft.com/office/2019/extlst" xmlns:r="http://schemas.openxmlformats.org/officeDocument/2006/relationships" xmlns:m="http://schemas.openxmlformats.org/officeDocument/2006/math" xmlns:v="urn:schemas-microsoft-com:vml" xmlns:wp14="http://schemas.microsoft.com/office/word/2010/wordprocessingDrawing" xmlns:wp="http://schemas.openxmlformats.org/drawingml/2006/wordprocessingDrawing" xmlns:w10="urn:schemas-microsoft-com:office:word" xmlns:w="http://schemas.openxmlformats.org/wordprocessingml/2006/main" xmlns:w14="http://schemas.microsoft.com/office/word/2010/wordml" xmlns:w15="http://schemas.microsoft.com/office/word/2012/wordml" xmlns:w16cex="http://schemas.microsoft.com/office/word/2018/wordml/cex" xmlns:w16cid="http://schemas.microsoft.com/office/word/2016/wordml/cid" xmlns:w16="http://schemas.microsoft.com/office/word/2018/wordml" xmlns:w16du="http://schemas.microsoft.com/office/word/2023/wordml/word16du" xmlns:w16sdtdh="http://schemas.microsoft.com/office/word/2020/wordml/sdtdatahash" xmlns:w16sdtfl="http://schemas.microsoft.com/office/word/2024/wordml/sdtformatlock" xmlns:w16se="http://schemas.microsoft.com/office/word/2015/wordml/symex" xmlns:wpg="http://schemas.microsoft.com/office/word/2010/wordprocessingGroup" xmlns:wpi="http://schemas.microsoft.com/office/word/2010/wordprocessingInk" xmlns:wne="http://schemas.microsoft.com/office/word/2006/wordml" xmlns:wps="http://schemas.microsoft.com/office/word/2010/wordprocessingShape" mc:Ignorable="w14 w15 w16se w16cid w16 w16cex w16sdtdh w16sdtfl w16du wp14">
   <w:abstractNum w:abstractNumId="0" w15:restartNumberingAfterBreak="0">
+    <w:nsid w:val="2E757282"/>
+    <w:multiLevelType w:val="hybridMultilevel"/>
+    <w:tmpl w:val="24E25440"/>
+    <w:lvl w:ilvl="0" w:tplc="F57C24E8">
+      <w:numFmt w:val="bullet"/>
+      <w:lvlText w:val=""/>
+      <w:lvlJc w:val="left"/>
+      <w:pPr>
+        <w:ind w:left="720" w:hanging="360"/>
+      </w:pPr>
+      <w:rPr>
+        <w:rFonts w:ascii="Symbol" w:eastAsiaTheme="minorHAnsi" w:hAnsi="Symbol" w:cstheme="minorBidi" w:hint="default"/>
+      </w:rPr>
+    </w:lvl>
+    <w:lvl w:ilvl="1" w:tplc="08090003" w:tentative="1">
+      <w:start w:val="1"/>
+      <w:numFmt w:val="bullet"/>
+      <w:lvlText w:val="o"/>
+      <w:lvlJc w:val="left"/>
+      <w:pPr>
+        <w:ind w:left="1440" w:hanging="360"/>
+      </w:pPr>
+      <w:rPr>
+        <w:rFonts w:ascii="Courier New" w:hAnsi="Courier New" w:cs="Courier New" w:hint="default"/>
+      </w:rPr>
+    </w:lvl>
+    <w:lvl w:ilvl="2" w:tplc="08090005" w:tentative="1">
+      <w:start w:val="1"/>
+      <w:numFmt w:val="bullet"/>
+      <w:lvlText w:val=""/>
+      <w:lvlJc w:val="left"/>
+      <w:pPr>
+        <w:ind w:left="2160" w:hanging="360"/>
+      </w:pPr>
+      <w:rPr>
+        <w:rFonts w:ascii="Wingdings" w:hAnsi="Wingdings" w:hint="default"/>
+      </w:rPr>
+    </w:lvl>
+    <w:lvl w:ilvl="3" w:tplc="08090001" w:tentative="1">
+      <w:start w:val="1"/>
+      <w:numFmt w:val="bullet"/>
+      <w:lvlText w:val=""/>
+      <w:lvlJc w:val="left"/>
+      <w:pPr>
+        <w:ind w:left="2880" w:hanging="360"/>
+      </w:pPr>
+      <w:rPr>
+        <w:rFonts w:ascii="Symbol" w:hAnsi="Symbol" w:hint="default"/>
+      </w:rPr>
+    </w:lvl>
+    <w:lvl w:ilvl="4" w:tplc="08090003" w:tentative="1">
+      <w:start w:val="1"/>
+      <w:numFmt w:val="bullet"/>
+      <w:lvlText w:val="o"/>
+      <w:lvlJc w:val="left"/>
+      <w:pPr>
+        <w:ind w:left="3600" w:hanging="360"/>
+      </w:pPr>
+      <w:rPr>
+        <w:rFonts w:ascii="Courier New" w:hAnsi="Courier New" w:cs="Courier New" w:hint="default"/>
+      </w:rPr>
+    </w:lvl>
+    <w:lvl w:ilvl="5" w:tplc="08090005" w:tentative="1">
+      <w:start w:val="1"/>
+      <w:numFmt w:val="bullet"/>
+      <w:lvlText w:val=""/>
+      <w:lvlJc w:val="left"/>
+      <w:pPr>
+        <w:ind w:left="4320" w:hanging="360"/>
+      </w:pPr>
+      <w:rPr>
+        <w:rFonts w:ascii="Wingdings" w:hAnsi="Wingdings" w:hint="default"/>
+      </w:rPr>
+    </w:lvl>
+    <w:lvl w:ilvl="6" w:tplc="08090001" w:tentative="1">
+      <w:start w:val="1"/>
+      <w:numFmt w:val="bullet"/>
+      <w:lvlText w:val=""/>
+      <w:lvlJc w:val="left"/>
+      <w:pPr>
+        <w:ind w:left="5040" w:hanging="360"/>
+      </w:pPr>
+      <w:rPr>
+        <w:rFonts w:ascii="Symbol" w:hAnsi="Symbol" w:hint="default"/>
+      </w:rPr>
+    </w:lvl>
+    <w:lvl w:ilvl="7" w:tplc="08090003" w:tentative="1">
+      <w:start w:val="1"/>
+      <w:numFmt w:val="bullet"/>
+      <w:lvlText w:val="o"/>
+      <w:lvlJc w:val="left"/>
+      <w:pPr>
+        <w:ind w:left="5760" w:hanging="360"/>
+      </w:pPr>
+      <w:rPr>
+        <w:rFonts w:ascii="Courier New" w:hAnsi="Courier New" w:cs="Courier New" w:hint="default"/>
+      </w:rPr>
+    </w:lvl>
+    <w:lvl w:ilvl="8" w:tplc="08090005" w:tentative="1">
+      <w:start w:val="1"/>
+      <w:numFmt w:val="bullet"/>
+      <w:lvlText w:val=""/>
+      <w:lvlJc w:val="left"/>
+      <w:pPr>
+        <w:ind w:left="6480" w:hanging="360"/>
+      </w:pPr>
+      <w:rPr>
+        <w:rFonts w:ascii="Wingdings" w:hAnsi="Wingdings" w:hint="default"/>
+      </w:rPr>
+    </w:lvl>
+  </w:abstractNum>
+  <w:abstractNum w:abstractNumId="1" w15:restartNumberingAfterBreak="0">
+    <w:nsid w:val="406762EA"/>
+    <w:multiLevelType w:val="hybridMultilevel"/>
+    <w:tmpl w:val="46FCBBB2"/>
+    <w:lvl w:ilvl="0" w:tplc="7C460F6E">
+      <w:numFmt w:val="bullet"/>
+      <w:lvlText w:val="-"/>
+      <w:lvlJc w:val="left"/>
+      <w:pPr>
+        <w:ind w:left="720" w:hanging="360"/>
+      </w:pPr>
+      <w:rPr>
+        <w:rFonts w:ascii="Aptos" w:eastAsiaTheme="minorHAnsi" w:hAnsi="Aptos" w:cstheme="minorBidi" w:hint="default"/>
+      </w:rPr>
+    </w:lvl>
+    <w:lvl w:ilvl="1" w:tplc="08090003" w:tentative="1">
+      <w:start w:val="1"/>
+      <w:numFmt w:val="bullet"/>
+      <w:lvlText w:val="o"/>
+      <w:lvlJc w:val="left"/>
+      <w:pPr>
+        <w:ind w:left="1440" w:hanging="360"/>
+      </w:pPr>
+      <w:rPr>
+        <w:rFonts w:ascii="Courier New" w:hAnsi="Courier New" w:cs="Courier New" w:hint="default"/>
+      </w:rPr>
+    </w:lvl>
+    <w:lvl w:ilvl="2" w:tplc="08090005" w:tentative="1">
+      <w:start w:val="1"/>
+      <w:numFmt w:val="bullet"/>
+      <w:lvlText w:val=""/>
+      <w:lvlJc w:val="left"/>
+      <w:pPr>
+        <w:ind w:left="2160" w:hanging="360"/>
+      </w:pPr>
+      <w:rPr>
+        <w:rFonts w:ascii="Wingdings" w:hAnsi="Wingdings" w:hint="default"/>
+      </w:rPr>
+    </w:lvl>
+    <w:lvl w:ilvl="3" w:tplc="08090001" w:tentative="1">
+      <w:start w:val="1"/>
+      <w:numFmt w:val="bullet"/>
+      <w:lvlText w:val=""/>
+      <w:lvlJc w:val="left"/>
+      <w:pPr>
+        <w:ind w:left="2880" w:hanging="360"/>
+      </w:pPr>
+      <w:rPr>
+        <w:rFonts w:ascii="Symbol" w:hAnsi="Symbol" w:hint="default"/>
+      </w:rPr>
+    </w:lvl>
+    <w:lvl w:ilvl="4" w:tplc="08090003" w:tentative="1">
+      <w:start w:val="1"/>
+      <w:numFmt w:val="bullet"/>
+      <w:lvlText w:val="o"/>
+      <w:lvlJc w:val="left"/>
+      <w:pPr>
+        <w:ind w:left="3600" w:hanging="360"/>
+      </w:pPr>
+      <w:rPr>
+        <w:rFonts w:ascii="Courier New" w:hAnsi="Courier New" w:cs="Courier New" w:hint="default"/>
+      </w:rPr>
+    </w:lvl>
+    <w:lvl w:ilvl="5" w:tplc="08090005" w:tentative="1">
+      <w:start w:val="1"/>
+      <w:numFmt w:val="bullet"/>
+      <w:lvlText w:val=""/>
+      <w:lvlJc w:val="left"/>
+      <w:pPr>
+        <w:ind w:left="4320" w:hanging="360"/>
+      </w:pPr>
+      <w:rPr>
+        <w:rFonts w:ascii="Wingdings" w:hAnsi="Wingdings" w:hint="default"/>
+      </w:rPr>
+    </w:lvl>
+    <w:lvl w:ilvl="6" w:tplc="08090001" w:tentative="1">
+      <w:start w:val="1"/>
+      <w:numFmt w:val="bullet"/>
+      <w:lvlText w:val=""/>
+      <w:lvlJc w:val="left"/>
+      <w:pPr>
+        <w:ind w:left="5040" w:hanging="360"/>
+      </w:pPr>
+      <w:rPr>
+        <w:rFonts w:ascii="Symbol" w:hAnsi="Symbol" w:hint="default"/>
+      </w:rPr>
+    </w:lvl>
+    <w:lvl w:ilvl="7" w:tplc="08090003" w:tentative="1">
+      <w:start w:val="1"/>
+      <w:numFmt w:val="bullet"/>
+      <w:lvlText w:val="o"/>
+      <w:lvlJc w:val="left"/>
+      <w:pPr>
+        <w:ind w:left="5760" w:hanging="360"/>
+      </w:pPr>
+      <w:rPr>
+        <w:rFonts w:ascii="Courier New" w:hAnsi="Courier New" w:cs="Courier New" w:hint="default"/>
+      </w:rPr>
+    </w:lvl>
+    <w:lvl w:ilvl="8" w:tplc="08090005" w:tentative="1">
+      <w:start w:val="1"/>
+      <w:numFmt w:val="bullet"/>
+      <w:lvlText w:val=""/>
+      <w:lvlJc w:val="left"/>
+      <w:pPr>
+        <w:ind w:left="6480" w:hanging="360"/>
+      </w:pPr>
+      <w:rPr>
+        <w:rFonts w:ascii="Wingdings" w:hAnsi="Wingdings" w:hint="default"/>
+      </w:rPr>
+    </w:lvl>
+  </w:abstractNum>
+  <w:abstractNum w:abstractNumId="2" w15:restartNumberingAfterBreak="0">
     <w:nsid w:val="6BA5752B"/>
     <w:multiLevelType w:val="hybridMultilevel"/>
     <w:tmpl w:val="678E1BD8"/>
@@ -629,7 +1080,7 @@
       </w:pPr>
     </w:lvl>
   </w:abstractNum>
-  <w:abstractNum w:abstractNumId="1" w15:restartNumberingAfterBreak="0">
+  <w:abstractNum w:abstractNumId="3" w15:restartNumberingAfterBreak="0">
     <w:nsid w:val="6BD91F6E"/>
     <w:multiLevelType w:val="hybridMultilevel"/>
     <w:tmpl w:val="225C92D4"/>
@@ -741,7 +1192,119 @@
       </w:rPr>
     </w:lvl>
   </w:abstractNum>
-  <w:abstractNum w:abstractNumId="2" w15:restartNumberingAfterBreak="0">
+  <w:abstractNum w:abstractNumId="4" w15:restartNumberingAfterBreak="0">
+    <w:nsid w:val="78005767"/>
+    <w:multiLevelType w:val="hybridMultilevel"/>
+    <w:tmpl w:val="2CC01878"/>
+    <w:lvl w:ilvl="0" w:tplc="0D2CC1B8">
+      <w:numFmt w:val="bullet"/>
+      <w:lvlText w:val="-"/>
+      <w:lvlJc w:val="left"/>
+      <w:pPr>
+        <w:ind w:left="720" w:hanging="360"/>
+      </w:pPr>
+      <w:rPr>
+        <w:rFonts w:ascii="Aptos" w:eastAsiaTheme="minorHAnsi" w:hAnsi="Aptos" w:cstheme="minorBidi" w:hint="default"/>
+      </w:rPr>
+    </w:lvl>
+    <w:lvl w:ilvl="1" w:tplc="08090003" w:tentative="1">
+      <w:start w:val="1"/>
+      <w:numFmt w:val="bullet"/>
+      <w:lvlText w:val="o"/>
+      <w:lvlJc w:val="left"/>
+      <w:pPr>
+        <w:ind w:left="1440" w:hanging="360"/>
+      </w:pPr>
+      <w:rPr>
+        <w:rFonts w:ascii="Courier New" w:hAnsi="Courier New" w:cs="Courier New" w:hint="default"/>
+      </w:rPr>
+    </w:lvl>
+    <w:lvl w:ilvl="2" w:tplc="08090005" w:tentative="1">
+      <w:start w:val="1"/>
+      <w:numFmt w:val="bullet"/>
+      <w:lvlText w:val=""/>
+      <w:lvlJc w:val="left"/>
+      <w:pPr>
+        <w:ind w:left="2160" w:hanging="360"/>
+      </w:pPr>
+      <w:rPr>
+        <w:rFonts w:ascii="Wingdings" w:hAnsi="Wingdings" w:hint="default"/>
+      </w:rPr>
+    </w:lvl>
+    <w:lvl w:ilvl="3" w:tplc="08090001" w:tentative="1">
+      <w:start w:val="1"/>
+      <w:numFmt w:val="bullet"/>
+      <w:lvlText w:val=""/>
+      <w:lvlJc w:val="left"/>
+      <w:pPr>
+        <w:ind w:left="2880" w:hanging="360"/>
+      </w:pPr>
+      <w:rPr>
+        <w:rFonts w:ascii="Symbol" w:hAnsi="Symbol" w:hint="default"/>
+      </w:rPr>
+    </w:lvl>
+    <w:lvl w:ilvl="4" w:tplc="08090003" w:tentative="1">
+      <w:start w:val="1"/>
+      <w:numFmt w:val="bullet"/>
+      <w:lvlText w:val="o"/>
+      <w:lvlJc w:val="left"/>
+      <w:pPr>
+        <w:ind w:left="3600" w:hanging="360"/>
+      </w:pPr>
+      <w:rPr>
+        <w:rFonts w:ascii="Courier New" w:hAnsi="Courier New" w:cs="Courier New" w:hint="default"/>
+      </w:rPr>
+    </w:lvl>
+    <w:lvl w:ilvl="5" w:tplc="08090005" w:tentative="1">
+      <w:start w:val="1"/>
+      <w:numFmt w:val="bullet"/>
+      <w:lvlText w:val=""/>
+      <w:lvlJc w:val="left"/>
+      <w:pPr>
+        <w:ind w:left="4320" w:hanging="360"/>
+      </w:pPr>
+      <w:rPr>
+        <w:rFonts w:ascii="Wingdings" w:hAnsi="Wingdings" w:hint="default"/>
+      </w:rPr>
+    </w:lvl>
+    <w:lvl w:ilvl="6" w:tplc="08090001" w:tentative="1">
+      <w:start w:val="1"/>
+      <w:numFmt w:val="bullet"/>
+      <w:lvlText w:val=""/>
+      <w:lvlJc w:val="left"/>
+      <w:pPr>
+        <w:ind w:left="5040" w:hanging="360"/>
+      </w:pPr>
+      <w:rPr>
+        <w:rFonts w:ascii="Symbol" w:hAnsi="Symbol" w:hint="default"/>
+      </w:rPr>
+    </w:lvl>
+    <w:lvl w:ilvl="7" w:tplc="08090003" w:tentative="1">
+      <w:start w:val="1"/>
+      <w:numFmt w:val="bullet"/>
+      <w:lvlText w:val="o"/>
+      <w:lvlJc w:val="left"/>
+      <w:pPr>
+        <w:ind w:left="5760" w:hanging="360"/>
+      </w:pPr>
+      <w:rPr>
+        <w:rFonts w:ascii="Courier New" w:hAnsi="Courier New" w:cs="Courier New" w:hint="default"/>
+      </w:rPr>
+    </w:lvl>
+    <w:lvl w:ilvl="8" w:tplc="08090005" w:tentative="1">
+      <w:start w:val="1"/>
+      <w:numFmt w:val="bullet"/>
+      <w:lvlText w:val=""/>
+      <w:lvlJc w:val="left"/>
+      <w:pPr>
+        <w:ind w:left="6480" w:hanging="360"/>
+      </w:pPr>
+      <w:rPr>
+        <w:rFonts w:ascii="Wingdings" w:hAnsi="Wingdings" w:hint="default"/>
+      </w:rPr>
+    </w:lvl>
+  </w:abstractNum>
+  <w:abstractNum w:abstractNumId="5" w15:restartNumberingAfterBreak="0">
     <w:nsid w:val="7AC2436C"/>
     <w:multiLevelType w:val="hybridMultilevel"/>
     <w:tmpl w:val="A0987B96"/>
@@ -853,7 +1416,7 @@
       </w:rPr>
     </w:lvl>
   </w:abstractNum>
-  <w:abstractNum w:abstractNumId="3" w15:restartNumberingAfterBreak="0">
+  <w:abstractNum w:abstractNumId="6" w15:restartNumberingAfterBreak="0">
     <w:nsid w:val="7B030214"/>
     <w:multiLevelType w:val="hybridMultilevel"/>
     <w:tmpl w:val="16D40DCE"/>
@@ -966,16 +1529,25 @@
     </w:lvl>
   </w:abstractNum>
   <w:num w:numId="1" w16cid:durableId="1347515547">
-    <w:abstractNumId w:val="1"/>
+    <w:abstractNumId w:val="3"/>
   </w:num>
   <w:num w:numId="2" w16cid:durableId="111246723">
+    <w:abstractNumId w:val="2"/>
+  </w:num>
+  <w:num w:numId="3" w16cid:durableId="1740133150">
+    <w:abstractNumId w:val="5"/>
+  </w:num>
+  <w:num w:numId="4" w16cid:durableId="1004894247">
+    <w:abstractNumId w:val="6"/>
+  </w:num>
+  <w:num w:numId="5" w16cid:durableId="355037868">
+    <w:abstractNumId w:val="4"/>
+  </w:num>
+  <w:num w:numId="6" w16cid:durableId="758059462">
     <w:abstractNumId w:val="0"/>
   </w:num>
-  <w:num w:numId="3" w16cid:durableId="1740133150">
-    <w:abstractNumId w:val="2"/>
-  </w:num>
-  <w:num w:numId="4" w16cid:durableId="1004894247">
-    <w:abstractNumId w:val="3"/>
+  <w:num w:numId="7" w16cid:durableId="1033337221">
+    <w:abstractNumId w:val="1"/>
   </w:num>
 </w:numbering>
 </file>

</xml_diff>

<commit_message>
Updated ants and report
</commit_message>
<xml_diff>
--- a/CS3IPDocuments/Term 1 Report - Ricky Nandhra - Final Year Project.docx
+++ b/CS3IPDocuments/Term 1 Report - Ricky Nandhra - Final Year Project.docx
@@ -225,7 +225,13 @@
         <w:t xml:space="preserve"> and</w:t>
       </w:r>
       <w:r>
-        <w:t xml:space="preserve"> Unreal Engine and </w:t>
+        <w:t xml:space="preserve"> Unreal </w:t>
+      </w:r>
+      <w:r>
+        <w:t>Engine,</w:t>
+      </w:r>
+      <w:r>
+        <w:t xml:space="preserve"> and </w:t>
       </w:r>
       <w:r>
         <w:t xml:space="preserve">the go-to open-source game engine is </w:t>
@@ -243,12 +249,24 @@
       </w:r>
       <w:r>
         <w:lastRenderedPageBreak/>
-        <w:t>3D. Both of these factors are unimportant to my project, so I chose to work with Unity – an industry standard, that excels at both 2D and 3D graphics.</w:t>
-      </w:r>
-    </w:p>
-    <w:p>
-      <w:r>
-        <w:t xml:space="preserve">There are many emergent behaviours of ants following pheromones, one in particular is a phenomenon called ant milling, also known as a </w:t>
+        <w:t xml:space="preserve">3D. </w:t>
+      </w:r>
+      <w:r>
+        <w:t>Both</w:t>
+      </w:r>
+      <w:r>
+        <w:t xml:space="preserve"> factors are unimportant to my project, so I chose to work with Unity – an industry standard, that excels at both 2D and 3D graphics.</w:t>
+      </w:r>
+    </w:p>
+    <w:p>
+      <w:r>
+        <w:t xml:space="preserve">There are many emergent behaviours of ants following pheromones, one </w:t>
+      </w:r>
+      <w:r>
+        <w:t>is</w:t>
+      </w:r>
+      <w:r>
+        <w:t xml:space="preserve"> a phenomenon called ant milling, also known as a </w:t>
       </w:r>
       <w:r>
         <w:t>“</w:t>
@@ -263,7 +281,13 @@
         <w:t>. Ants mostly solely rely on pheromones to navigate and, sometimes, ‘a group of foragers are separated from the main swarm’ and ‘the separated workers then run in a densely packed circle until they die of exhaustion’</w:t>
       </w:r>
       <w:r>
-        <w:t xml:space="preserve">. So if I see this emergent behaviour from my system, I do not need to try and fix this functionality.  </w:t>
+        <w:t xml:space="preserve">. </w:t>
+      </w:r>
+      <w:r>
+        <w:t>So,</w:t>
+      </w:r>
+      <w:r>
+        <w:t xml:space="preserve"> if I see this emergent behaviour from my system, I do not need to try and fix this functionality.  </w:t>
       </w:r>
     </w:p>
     <w:p>
@@ -352,7 +376,101 @@
         <w:t>NASA</w:t>
       </w:r>
       <w:r>
-        <w:t xml:space="preserve">, or any other space exploration company, can focus on science. </w:t>
+        <w:t xml:space="preserve">, or </w:t>
+      </w:r>
+      <w:r>
+        <w:t>another</w:t>
+      </w:r>
+      <w:r>
+        <w:t xml:space="preserve"> space exploration company, can focus on science. </w:t>
+      </w:r>
+    </w:p>
+    <w:p>
+      <w:pPr>
+        <w:pStyle w:val="Heading2"/>
+      </w:pPr>
+      <w:r>
+        <w:t>Planning</w:t>
+      </w:r>
+      <w:r>
+        <w:t xml:space="preserve"> and Methodology</w:t>
+      </w:r>
+    </w:p>
+    <w:p>
+      <w:r>
+        <w:t xml:space="preserve">Having chosen my software, language and knowing my research question, a well formulated plan will allow me to complete this </w:t>
+      </w:r>
+      <w:r>
+        <w:t xml:space="preserve">project </w:t>
+      </w:r>
+      <w:r>
+        <w:t xml:space="preserve">within the tight deadline. </w:t>
+      </w:r>
+      <w:r>
+        <w:t>Another factor to consider is that this project is highly uncertain, I will need to learn Unity, as well as C#, indicating that an iterative and prototype-driven Agile approach is best. This will ensure early experimentation promoting my own learning, reducing the risk of long-term pitfalls, as well as enabling previous iterations to inform future decision making.</w:t>
+      </w:r>
+    </w:p>
+    <w:p>
+      <w:r>
+        <w:t>I will use throwaway prototyping – enabling the comparison of alternative solutions as the final design of what I will produce is unclear. This decision will also allow me to have an early minimum viable product</w:t>
+      </w:r>
+      <w:r>
+        <w:t xml:space="preserve"> (MVP)</w:t>
+      </w:r>
+      <w:r>
+        <w:t xml:space="preserve">, while learning by doing. I will also be using Agile methodologies, as my own decisions match with the Agile Manifesto – I am prioritising working software over documentation and </w:t>
+      </w:r>
+      <w:r>
+        <w:t xml:space="preserve">responding to change due to my lack of knowledge within Unity over following a plan precisely. A key point is that I am working on this project alone – Agile is typically used by a whole team, categorised into three different roles. As such, I will be adapting Agile methodologies to the best of my ability. </w:t>
+      </w:r>
+    </w:p>
+    <w:p>
+      <w:r>
+        <w:t>It is for the reasons above that I incidentally disregarded the other methodologies</w:t>
+      </w:r>
+      <w:r>
+        <w:t>.</w:t>
+      </w:r>
+      <w:r>
+        <w:t xml:space="preserve"> Waterfall </w:t>
+      </w:r>
+      <w:r>
+        <w:t xml:space="preserve">is at its best used when there is a concrete plan, which is impossible for a task like this with no prior knowledge of what needs to be done. Extreme programming is at its best when it is test-driven, </w:t>
+      </w:r>
+      <w:r>
+        <w:lastRenderedPageBreak/>
+        <w:t xml:space="preserve">but, as with Waterfall, this is also impossible as if I do not know what needs to be done, then I cannot know what needs to be tested. </w:t>
+      </w:r>
+    </w:p>
+    <w:p>
+      <w:r>
+        <w:t xml:space="preserve">I will also use Kanban via Trello to track my progress. This means I will have four main bins </w:t>
+      </w:r>
+      <w:r>
+        <w:t xml:space="preserve">for </w:t>
+      </w:r>
+      <w:r>
+        <w:t xml:space="preserve">tasks that need to be completed in order of importance and dependencies. The bins include project backlog, a to-do list, an in-progress list and a completed list. </w:t>
+      </w:r>
+      <w:r>
+        <w:t xml:space="preserve">I will also include bins for researching and debugging as those are likely to be needed. Starting tasks will be much simpler than those added towards the deadline – this is because I will have more of an understanding of how to use Unity and what limits it may or may not have, showing me how far I will have gone. </w:t>
+      </w:r>
+    </w:p>
+    <w:p>
+      <w:r>
+        <w:t>In the first two months (October-November) I will start by studying how to use Unity and implementing basic ants with little-to-no functionality.</w:t>
+      </w:r>
+      <w:r>
+        <w:t xml:space="preserve"> I will then study ant behaviour, ACO and learn more about Unity so that</w:t>
+      </w:r>
+      <w:r>
+        <w:t xml:space="preserve"> </w:t>
+      </w:r>
+      <w:r>
+        <w:t>b</w:t>
+      </w:r>
+      <w:r>
+        <w:t xml:space="preserve">y January I have ants that can collect food and return it to the colony autonomously, and by the end of February I should have an almost complete simulation environment so that in March and April I can focus on finding results for my research question. </w:t>
       </w:r>
     </w:p>
     <w:p>
@@ -492,7 +610,6 @@
     </w:p>
     <w:p>
       <w:r>
-        <w:lastRenderedPageBreak/>
         <w:t>Ants should also be able to</w:t>
       </w:r>
     </w:p>
@@ -540,12 +657,21 @@
         <w:t>functionalities</w:t>
       </w:r>
       <w:r>
-        <w:t xml:space="preserve"> will be viable for me to create a minimum viable product and tune parameters that may need tuning, for example the pheromone evaporation rate. </w:t>
-      </w:r>
-    </w:p>
-    <w:p>
-      <w:r>
-        <w:t>Unity uses a main loop, referred to as the Update function. This function executes every frame</w:t>
+        <w:t xml:space="preserve"> will be viable for me to create a </w:t>
+      </w:r>
+      <w:r>
+        <w:t>MVP</w:t>
+      </w:r>
+      <w:r>
+        <w:t xml:space="preserve"> and tune parameters that may need tuning, for example the pheromone evaporation rate. </w:t>
+      </w:r>
+      <w:r>
+        <w:t>I will need to design algorithms around these requirements to get the correct functionality and then execute those algorithms inside of Unity’s main loop, called the Update function.</w:t>
+      </w:r>
+    </w:p>
+    <w:p>
+      <w:r>
+        <w:t>This function executes every frame</w:t>
       </w:r>
       <w:r>
         <w:t xml:space="preserve"> – a single</w:t>
@@ -554,10 +680,41 @@
         <w:t>, completely rendered image and displayed on screen, frames are measured in frames per second (FPS). This will b</w:t>
       </w:r>
       <w:r>
-        <w:t>e my performance indicator – I will aim to have the FPS above 60, but as a minimum I will aim for 30 FPS</w:t>
-      </w:r>
-      <w:r>
-        <w:t xml:space="preserve"> as this will mean the simulation will look smooth. This Update loop will contain every line of code, except for those that only need to run one </w:t>
+        <w:t>e my</w:t>
+      </w:r>
+      <w:r>
+        <w:t xml:space="preserve"> main</w:t>
+      </w:r>
+      <w:r>
+        <w:t xml:space="preserve"> </w:t>
+      </w:r>
+      <w:r>
+        <w:t xml:space="preserve">simulation </w:t>
+      </w:r>
+      <w:r>
+        <w:t xml:space="preserve">performance indicator – I will aim to have the FPS above 60, but as a minimum I will aim for 30 </w:t>
+      </w:r>
+      <w:r>
+        <w:lastRenderedPageBreak/>
+        <w:t>FPS</w:t>
+      </w:r>
+      <w:r>
+        <w:t xml:space="preserve">. Although this </w:t>
+      </w:r>
+      <w:r>
+        <w:t>will</w:t>
+      </w:r>
+      <w:r>
+        <w:t xml:space="preserve"> not affect the performance of the code itself, it is important to keep FPS high</w:t>
+      </w:r>
+      <w:r>
+        <w:t xml:space="preserve"> as this will mean the simulation will look </w:t>
+      </w:r>
+      <w:r>
+        <w:t>smooth but also means that the simulation takes less time to reach a desired state</w:t>
+      </w:r>
+      <w:r>
+        <w:t xml:space="preserve">. This Update loop will contain every line of code, except for those that only need to run one </w:t>
       </w:r>
       <w:r>
         <w:t xml:space="preserve">time – like storing the position of the colony, or initialising ants. </w:t>
@@ -592,12 +749,34 @@
         <w:t xml:space="preserve">This second version lost no functionality and was more scalable. Measured by the frames per second (FPS) during execution – the first prototype </w:t>
       </w:r>
       <w:r>
-        <w:t xml:space="preserve">simulated 100 ants, 1 colony and 1 food source (with additional GameObjects reserved for pheromones) and achieved on average 20FPS. The second prototype simulated 1,000 ants, 1 colony and 1 food source, using only 2 GameObjects and achieved on average 100FPS. On average, a 400% increase in performance. </w:t>
-      </w:r>
-    </w:p>
-    <w:p>
-      <w:r>
-        <w:t xml:space="preserve">However, there were a couple of pitfalls. The initial prototype was well-tuned with the initial values I had set, this second prototype, as I made the search space larger and the ants smaller, the values were seemingly off and as such I had to spend time testing which values worked best for various parameters. </w:t>
+        <w:t>simulated 100 ants, 1 colony and 1 food source (with additional GameObjects reserved for pheromones) and achieved on average 20</w:t>
+      </w:r>
+      <w:r>
+        <w:t xml:space="preserve"> </w:t>
+      </w:r>
+      <w:r>
+        <w:t>FPS</w:t>
+      </w:r>
+      <w:r>
+        <w:t xml:space="preserve"> – lower than my 30 FPS floor</w:t>
+      </w:r>
+      <w:r>
+        <w:t>. The second prototype simulated 1,000 ants, 1 colony and 1 food source, using only 2 GameObjects and achieved on average 100</w:t>
+      </w:r>
+      <w:r>
+        <w:t xml:space="preserve"> </w:t>
+      </w:r>
+      <w:r>
+        <w:t>FPS. On average, a 400% increase in performance.</w:t>
+      </w:r>
+      <w:r>
+        <w:t xml:space="preserve"> Moving forward, I will try to reduce the number of GameObjects I have on screen at any given time, </w:t>
+      </w:r>
+      <w:r>
+        <w:t>to ensure that I stay above 30 FPS.</w:t>
+      </w:r>
+      <w:r>
+        <w:t xml:space="preserve"> </w:t>
       </w:r>
     </w:p>
     <w:p>
@@ -606,145 +785,118 @@
           <w:noProof/>
         </w:rPr>
       </w:pPr>
-      <w:r>
-        <w:rPr>
-          <w:noProof/>
-        </w:rPr>
-        <w:lastRenderedPageBreak/>
-        <w:drawing>
-          <wp:anchor distT="0" distB="0" distL="114300" distR="114300" simplePos="0" relativeHeight="251658240" behindDoc="0" locked="0" layoutInCell="1" allowOverlap="1" wp14:anchorId="094D83DE" wp14:editId="2DC8766F">
-            <wp:simplePos x="0" y="0"/>
-            <wp:positionH relativeFrom="margin">
-              <wp:posOffset>3735705</wp:posOffset>
-            </wp:positionH>
-            <wp:positionV relativeFrom="paragraph">
-              <wp:posOffset>243205</wp:posOffset>
-            </wp:positionV>
-            <wp:extent cx="2002155" cy="1473200"/>
-            <wp:effectExtent l="0" t="0" r="0" b="0"/>
-            <wp:wrapSquare wrapText="bothSides"/>
-            <wp:docPr id="341239569" name="Picture 1"/>
-            <wp:cNvGraphicFramePr>
-              <a:graphicFrameLocks xmlns:a="http://schemas.openxmlformats.org/drawingml/2006/main" noChangeAspect="1"/>
-            </wp:cNvGraphicFramePr>
-            <a:graphic xmlns:a="http://schemas.openxmlformats.org/drawingml/2006/main">
-              <a:graphicData uri="http://schemas.openxmlformats.org/drawingml/2006/picture">
-                <pic:pic xmlns:pic="http://schemas.openxmlformats.org/drawingml/2006/picture">
-                  <pic:nvPicPr>
-                    <pic:cNvPr id="1565066194" name=""/>
-                    <pic:cNvPicPr/>
-                  </pic:nvPicPr>
-                  <pic:blipFill>
-                    <a:blip r:embed="rId5" cstate="print">
-                      <a:extLst>
-                        <a:ext uri="{28A0092B-C50C-407E-A947-70E740481C1C}">
-                          <a14:useLocalDpi xmlns:a14="http://schemas.microsoft.com/office/drawing/2010/main" val="0"/>
-                        </a:ext>
-                      </a:extLst>
-                    </a:blip>
-                    <a:stretch>
-                      <a:fillRect/>
-                    </a:stretch>
-                  </pic:blipFill>
-                  <pic:spPr>
-                    <a:xfrm>
-                      <a:off x="0" y="0"/>
-                      <a:ext cx="2002155" cy="1473200"/>
-                    </a:xfrm>
-                    <a:prstGeom prst="rect">
-                      <a:avLst/>
-                    </a:prstGeom>
-                  </pic:spPr>
-                </pic:pic>
-              </a:graphicData>
-            </a:graphic>
-          </wp:anchor>
-        </w:drawing>
-      </w:r>
       <w:r>
         <w:rPr>
           <w:noProof/>
         </w:rPr>
         <mc:AlternateContent>
-          <mc:Choice Requires="wps">
+          <mc:Choice Requires="wpg">
             <w:drawing>
-              <wp:anchor distT="0" distB="0" distL="114300" distR="114300" simplePos="0" relativeHeight="251660288" behindDoc="1" locked="0" layoutInCell="1" allowOverlap="1" wp14:anchorId="64FF24B6" wp14:editId="3102A3D6">
+              <wp:anchor distT="0" distB="0" distL="114300" distR="114300" simplePos="0" relativeHeight="251660288" behindDoc="0" locked="0" layoutInCell="1" allowOverlap="1" wp14:anchorId="50A0623A" wp14:editId="3C02205C">
                 <wp:simplePos x="0" y="0"/>
                 <wp:positionH relativeFrom="margin">
-                  <wp:posOffset>3735705</wp:posOffset>
+                  <wp:align>right</wp:align>
                 </wp:positionH>
                 <wp:positionV relativeFrom="paragraph">
-                  <wp:posOffset>1721485</wp:posOffset>
+                  <wp:posOffset>0</wp:posOffset>
                 </wp:positionV>
-                <wp:extent cx="2002155" cy="635"/>
-                <wp:effectExtent l="0" t="0" r="0" b="0"/>
+                <wp:extent cx="2002155" cy="1744980"/>
+                <wp:effectExtent l="0" t="0" r="0" b="7620"/>
                 <wp:wrapSquare wrapText="bothSides"/>
-                <wp:docPr id="520044859" name="Text Box 1"/>
+                <wp:docPr id="1224166233" name="Group 2"/>
                 <wp:cNvGraphicFramePr/>
                 <a:graphic xmlns:a="http://schemas.openxmlformats.org/drawingml/2006/main">
-                  <a:graphicData uri="http://schemas.microsoft.com/office/word/2010/wordprocessingShape">
-                    <wps:wsp>
-                      <wps:cNvSpPr txBox="1"/>
-                      <wps:spPr>
+                  <a:graphicData uri="http://schemas.microsoft.com/office/word/2010/wordprocessingGroup">
+                    <wpg:wgp>
+                      <wpg:cNvGrpSpPr/>
+                      <wpg:grpSpPr>
                         <a:xfrm>
                           <a:off x="0" y="0"/>
-                          <a:ext cx="2002155" cy="635"/>
+                          <a:ext cx="2002155" cy="1744980"/>
+                          <a:chOff x="0" y="0"/>
+                          <a:chExt cx="2002155" cy="1744980"/>
                         </a:xfrm>
-                        <a:prstGeom prst="rect">
-                          <a:avLst/>
-                        </a:prstGeom>
-                        <a:solidFill>
-                          <a:prstClr val="white"/>
-                        </a:solidFill>
-                        <a:ln>
-                          <a:noFill/>
-                        </a:ln>
-                      </wps:spPr>
-                      <wps:txbx>
-                        <w:txbxContent>
-                          <w:p>
-                            <w:pPr>
-                              <w:pStyle w:val="Caption"/>
-                              <w:rPr>
-                                <w:noProof/>
-                                <w:sz w:val="22"/>
-                                <w:szCs w:val="22"/>
-                              </w:rPr>
-                            </w:pPr>
-                            <w:r>
-                              <w:t xml:space="preserve">Figure </w:t>
-                            </w:r>
-                            <w:r>
-                              <w:fldChar w:fldCharType="begin"/>
-                            </w:r>
-                            <w:r>
-                              <w:instrText xml:space="preserve"> SEQ Figure \* ARABIC </w:instrText>
-                            </w:r>
-                            <w:r>
-                              <w:fldChar w:fldCharType="separate"/>
-                            </w:r>
-                            <w:r>
-                              <w:rPr>
-                                <w:noProof/>
-                              </w:rPr>
-                              <w:t>1</w:t>
-                            </w:r>
-                            <w:r>
-                              <w:rPr>
-                                <w:noProof/>
-                              </w:rPr>
-                              <w:fldChar w:fldCharType="end"/>
-                            </w:r>
-                          </w:p>
-                        </w:txbxContent>
-                      </wps:txbx>
-                      <wps:bodyPr rot="0" spcFirstLastPara="0" vertOverflow="overflow" horzOverflow="overflow" vert="horz" wrap="square" lIns="0" tIns="0" rIns="0" bIns="0" numCol="1" spcCol="0" rtlCol="0" fromWordArt="0" anchor="t" anchorCtr="0" forceAA="0" compatLnSpc="1">
-                        <a:prstTxWarp prst="textNoShape">
-                          <a:avLst/>
-                        </a:prstTxWarp>
-                        <a:spAutoFit/>
-                      </wps:bodyPr>
-                    </wps:wsp>
+                      </wpg:grpSpPr>
+                      <pic:pic xmlns:pic="http://schemas.openxmlformats.org/drawingml/2006/picture">
+                        <pic:nvPicPr>
+                          <pic:cNvPr id="1918892465" name="Picture 1"/>
+                          <pic:cNvPicPr>
+                            <a:picLocks noChangeAspect="1"/>
+                          </pic:cNvPicPr>
+                        </pic:nvPicPr>
+                        <pic:blipFill>
+                          <a:blip r:embed="rId5" cstate="print">
+                            <a:extLst>
+                              <a:ext uri="{28A0092B-C50C-407E-A947-70E740481C1C}">
+                                <a14:useLocalDpi xmlns:a14="http://schemas.microsoft.com/office/drawing/2010/main" val="0"/>
+                              </a:ext>
+                            </a:extLst>
+                          </a:blip>
+                          <a:stretch>
+                            <a:fillRect/>
+                          </a:stretch>
+                        </pic:blipFill>
+                        <pic:spPr>
+                          <a:xfrm>
+                            <a:off x="0" y="0"/>
+                            <a:ext cx="2002155" cy="1473200"/>
+                          </a:xfrm>
+                          <a:prstGeom prst="rect">
+                            <a:avLst/>
+                          </a:prstGeom>
+                        </pic:spPr>
+                      </pic:pic>
+                      <wps:wsp>
+                        <wps:cNvPr id="1710849016" name="Text Box 1"/>
+                        <wps:cNvSpPr txBox="1"/>
+                        <wps:spPr>
+                          <a:xfrm>
+                            <a:off x="0" y="1478280"/>
+                            <a:ext cx="2002155" cy="266700"/>
+                          </a:xfrm>
+                          <a:prstGeom prst="rect">
+                            <a:avLst/>
+                          </a:prstGeom>
+                          <a:solidFill>
+                            <a:prstClr val="white"/>
+                          </a:solidFill>
+                          <a:ln>
+                            <a:noFill/>
+                          </a:ln>
+                        </wps:spPr>
+                        <wps:txbx>
+                          <w:txbxContent>
+                            <w:p>
+                              <w:pPr>
+                                <w:pStyle w:val="Caption"/>
+                                <w:rPr>
+                                  <w:noProof/>
+                                  <w:sz w:val="22"/>
+                                  <w:szCs w:val="22"/>
+                                </w:rPr>
+                              </w:pPr>
+                              <w:r>
+                                <w:t xml:space="preserve">Figure </w:t>
+                              </w:r>
+                              <w:fldSimple w:instr=" SEQ Figure \* ARABIC ">
+                                <w:r>
+                                  <w:rPr>
+                                    <w:noProof/>
+                                  </w:rPr>
+                                  <w:t>1</w:t>
+                                </w:r>
+                              </w:fldSimple>
+                            </w:p>
+                          </w:txbxContent>
+                        </wps:txbx>
+                        <wps:bodyPr rot="0" spcFirstLastPara="0" vertOverflow="overflow" horzOverflow="overflow" vert="horz" wrap="square" lIns="0" tIns="0" rIns="0" bIns="0" numCol="1" spcCol="0" rtlCol="0" fromWordArt="0" anchor="t" anchorCtr="0" forceAA="0" compatLnSpc="1">
+                          <a:prstTxWarp prst="textNoShape">
+                            <a:avLst/>
+                          </a:prstTxWarp>
+                          <a:spAutoFit/>
+                        </wps:bodyPr>
+                      </wps:wsp>
+                    </wpg:wgp>
                   </a:graphicData>
                 </a:graphic>
               </wp:anchor>
@@ -752,110 +904,136 @@
           </mc:Choice>
           <mc:Fallback>
             <w:pict>
-              <v:shapetype w14:anchorId="64FF24B6" id="_x0000_t202" coordsize="21600,21600" o:spt="202" path="m,l,21600r21600,l21600,xe">
-                <v:stroke joinstyle="miter"/>
-                <v:path gradientshapeok="t" o:connecttype="rect"/>
-              </v:shapetype>
-              <v:shape id="Text Box 1" o:spid="_x0000_s1026" type="#_x0000_t202" style="position:absolute;margin-left:294.15pt;margin-top:135.55pt;width:157.65pt;height:.05pt;z-index:-251656192;visibility:visible;mso-wrap-style:square;mso-wrap-distance-left:9pt;mso-wrap-distance-top:0;mso-wrap-distance-right:9pt;mso-wrap-distance-bottom:0;mso-position-horizontal:absolute;mso-position-horizontal-relative:margin;mso-position-vertical:absolute;mso-position-vertical-relative:text;v-text-anchor:top" o:gfxdata="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" stroked="f">
-                <v:textbox style="mso-fit-shape-to-text:t" inset="0,0,0,0">
-                  <w:txbxContent>
-                    <w:p>
-                      <w:pPr>
-                        <w:pStyle w:val="Caption"/>
-                        <w:rPr>
-                          <w:noProof/>
-                          <w:sz w:val="22"/>
-                          <w:szCs w:val="22"/>
-                        </w:rPr>
-                      </w:pPr>
-                      <w:r>
-                        <w:t xml:space="preserve">Figure </w:t>
-                      </w:r>
-                      <w:r>
-                        <w:fldChar w:fldCharType="begin"/>
-                      </w:r>
-                      <w:r>
-                        <w:instrText xml:space="preserve"> SEQ Figure \* ARABIC </w:instrText>
-                      </w:r>
-                      <w:r>
-                        <w:fldChar w:fldCharType="separate"/>
-                      </w:r>
-                      <w:r>
-                        <w:rPr>
-                          <w:noProof/>
-                        </w:rPr>
-                        <w:t>1</w:t>
-                      </w:r>
-                      <w:r>
-                        <w:rPr>
-                          <w:noProof/>
-                        </w:rPr>
-                        <w:fldChar w:fldCharType="end"/>
-                      </w:r>
-                    </w:p>
-                  </w:txbxContent>
-                </v:textbox>
+              <v:group w14:anchorId="50A0623A" id="Group 2" o:spid="_x0000_s1026" style="position:absolute;margin-left:106.45pt;margin-top:0;width:157.65pt;height:137.4pt;z-index:251660288;mso-position-horizontal:right;mso-position-horizontal-relative:margin" coordsize="20021,17449" o:gfxdata="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">
+                <v:shapetype id="_x0000_t75" coordsize="21600,21600" o:spt="75" o:preferrelative="t" path="m@4@5l@4@11@9@11@9@5xe" filled="f" stroked="f">
+                  <v:stroke joinstyle="miter"/>
+                  <v:formulas>
+                    <v:f eqn="if lineDrawn pixelLineWidth 0"/>
+                    <v:f eqn="sum @0 1 0"/>
+                    <v:f eqn="sum 0 0 @1"/>
+                    <v:f eqn="prod @2 1 2"/>
+                    <v:f eqn="prod @3 21600 pixelWidth"/>
+                    <v:f eqn="prod @3 21600 pixelHeight"/>
+                    <v:f eqn="sum @0 0 1"/>
+                    <v:f eqn="prod @6 1 2"/>
+                    <v:f eqn="prod @7 21600 pixelWidth"/>
+                    <v:f eqn="sum @8 21600 0"/>
+                    <v:f eqn="prod @7 21600 pixelHeight"/>
+                    <v:f eqn="sum @10 21600 0"/>
+                  </v:formulas>
+                  <v:path o:extrusionok="f" gradientshapeok="t" o:connecttype="rect"/>
+                  <o:lock v:ext="edit" aspectratio="t"/>
+                </v:shapetype>
+                <v:shape id="Picture 1" o:spid="_x0000_s1027" type="#_x0000_t75" style="position:absolute;width:20021;height:14732;visibility:visible;mso-wrap-style:square" o:gfxdata="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">
+                  <v:imagedata r:id="rId6" o:title=""/>
+                </v:shape>
+                <v:shapetype id="_x0000_t202" coordsize="21600,21600" o:spt="202" path="m,l,21600r21600,l21600,xe">
+                  <v:stroke joinstyle="miter"/>
+                  <v:path gradientshapeok="t" o:connecttype="rect"/>
+                </v:shapetype>
+                <v:shape id="Text Box 1" o:spid="_x0000_s1028" type="#_x0000_t202" style="position:absolute;top:14782;width:20021;height:2667;visibility:visible;mso-wrap-style:square;v-text-anchor:top" o:gfxdata="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" stroked="f">
+                  <v:textbox style="mso-fit-shape-to-text:t" inset="0,0,0,0">
+                    <w:txbxContent>
+                      <w:p>
+                        <w:pPr>
+                          <w:pStyle w:val="Caption"/>
+                          <w:rPr>
+                            <w:noProof/>
+                            <w:sz w:val="22"/>
+                            <w:szCs w:val="22"/>
+                          </w:rPr>
+                        </w:pPr>
+                        <w:r>
+                          <w:t xml:space="preserve">Figure </w:t>
+                        </w:r>
+                        <w:fldSimple w:instr=" SEQ Figure \* ARABIC ">
+                          <w:r>
+                            <w:rPr>
+                              <w:noProof/>
+                            </w:rPr>
+                            <w:t>1</w:t>
+                          </w:r>
+                        </w:fldSimple>
+                      </w:p>
+                    </w:txbxContent>
+                  </v:textbox>
+                </v:shape>
                 <w10:wrap type="square" anchorx="margin"/>
-              </v:shape>
+              </v:group>
             </w:pict>
           </mc:Fallback>
         </mc:AlternateContent>
       </w:r>
       <w:r>
-        <w:t>Both of these prototypes did see ant milling and I could assume they were accurate.</w:t>
-      </w:r>
-      <w:r>
-        <w:t xml:space="preserve"> The green and red highlights in Figure 1</w:t>
+        <w:t>Both prototypes did see ant milling and I could assume they were accurate. The faint green and red highlights in Figure 1</w:t>
       </w:r>
       <w:r>
         <w:rPr>
           <w:noProof/>
         </w:rPr>
-        <w:t xml:space="preserve"> show the pheromones for that colony – this screenshot shows the early stage of ant milling, before the pheromone trail could be self-reinforced. However, from insepcting this image, I noticed that the ants were following pheromones regardless of how concentrated they were. This behaviour did lead to ant milling – but it also meant that the self-reinforcement part of laying trails to and from food sources did not matter. </w:t>
-      </w:r>
-      <w:r>
-        <w:rPr>
-          <w:noProof/>
-        </w:rPr>
-        <w:t xml:space="preserve">This functioanlity was inheritently wrong for ants and so, I updated the code so that are more concentrated pheromone would be followed. </w:t>
-      </w:r>
-    </w:p>
-    <w:p>
-      <w:r>
-        <w:rPr>
-          <w:noProof/>
-        </w:rPr>
-        <w:t>In both of my prototypes, I made it so that ants dropped pheromones as they move around, I also made it so that ants drop a different kind of pheromone if they are returning to their colony</w:t>
-      </w:r>
-      <w:r>
-        <w:rPr>
-          <w:noProof/>
-        </w:rPr>
-        <w:t>, only when they carried food</w:t>
-      </w:r>
-      <w:r>
-        <w:rPr>
-          <w:noProof/>
-        </w:rPr>
-        <w:t xml:space="preserve">. </w:t>
-      </w:r>
-      <w:r>
-        <w:rPr>
-          <w:noProof/>
-        </w:rPr>
-        <w:t xml:space="preserve">This functionality was inspired by </w:t>
-      </w:r>
-      <w:r>
-        <w:rPr>
-          <w:noProof/>
-        </w:rPr>
-        <w:t>Jackson and Ratnieks</w:t>
-      </w:r>
-      <w:r>
-        <w:rPr>
-          <w:noProof/>
-        </w:rPr>
-        <w:t xml:space="preserve">, who showed that ants use different pheromones with different strengths in various situations. My setup of pheromones, both the parameters and which pheromone trails were followed, specifically when they were followed, caused my ants to not act very randomly. In other words, exploration was discouraged and following trails was encouraged too much. </w:t>
+        <w:t xml:space="preserve"> show the pheromones for that colony – this screenshot shows the early stage of ant milling, before the pheromone trail could be self-reinforced. However, from insepcting the behaviour shown in this image, I noticed that the ants were following pheromones regardless of how concentrated they were. This behaviour did lead to ant milling – but it also meant that the self-reinforcement part of laying trails to and from food sources did not matter, ants would follow the nearest pheromone. This functioanlity was inheritently wrong for ants and so, I updated the code so that more concentrated pheromone are followed. </w:t>
+      </w:r>
+    </w:p>
+    <w:p>
+      <w:r>
+        <w:t>However, there were a couple of pitfalls</w:t>
+      </w:r>
+      <w:r>
+        <w:t xml:space="preserve"> that came along with this second prototype</w:t>
+      </w:r>
+      <w:r>
+        <w:t xml:space="preserve">. The initial prototype was well-tuned with the initial values I had set, this second prototype, as I made the search space larger and the ants smaller, the values were seemingly off and as such I had to spend time testing which values worked best for various parameters. </w:t>
+      </w:r>
+      <w:r>
+        <w:t xml:space="preserve">These values included the speed of the ant, how far forward it can see, how strong the pheromones the ants deposited </w:t>
+      </w:r>
+      <w:r>
+        <w:lastRenderedPageBreak/>
+        <w:t xml:space="preserve">were, how fast the pheromones decayed and how often the ants wander around the search space, not following pheromones and not returning home. </w:t>
+      </w:r>
+    </w:p>
+    <w:p>
+      <w:r>
+        <w:t>Another pitfall arose as I was reading Jackson and Ratnieks’ study</w:t>
+      </w:r>
+      <w:r>
+        <w:t xml:space="preserve">, </w:t>
+      </w:r>
+      <w:r>
+        <w:t xml:space="preserve">the ants dropped two kinds of pheromones. One when they were searching for food – represented when the Boolean carryingFood is false, and the other when they are returning home – when carryingFood is true. Jackson and Ratnieks suggested that an ant ‘colony forms a trail when successful foragers deposit pheromone on their </w:t>
+      </w:r>
+      <w:r>
+        <w:t>return to</w:t>
+      </w:r>
+      <w:r>
+        <w:t xml:space="preserve"> the nest’ </w:t>
+      </w:r>
+      <w:r>
+        <w:t>and</w:t>
+      </w:r>
+      <w:r>
+        <w:t xml:space="preserve"> suggesting self-reinforcement of that trail based on more ants </w:t>
+      </w:r>
+      <w:r>
+        <w:t xml:space="preserve">using </w:t>
+      </w:r>
+      <w:r>
+        <w:t>th</w:t>
+      </w:r>
+      <w:r>
+        <w:t>at</w:t>
+      </w:r>
+      <w:r>
+        <w:t xml:space="preserve"> trail.</w:t>
+      </w:r>
+      <w:r>
+        <w:t xml:space="preserve"> Considering this, I decided to update my code so that the ants followed the pheromone trail of the opposite type, if the ant was not carrying food, then follow the pheromone trail of the ants who were carrying food and vice versa. The outcomes </w:t>
+      </w:r>
+      <w:r>
+        <w:t>of this</w:t>
+      </w:r>
+      <w:r>
+        <w:t xml:space="preserve"> change were welcomed – there was a good balance between exploration and exploitation, movement started off random but slowly converged into ants moving to and from food.  </w:t>
       </w:r>
     </w:p>
     <w:p>
@@ -867,6 +1045,55 @@
       </w:r>
     </w:p>
     <w:p>
+      <w:r>
+        <w:t xml:space="preserve">Ant sprite is used from </w:t>
+      </w:r>
+      <w:hyperlink r:id="rId7" w:history="1">
+        <w:r>
+          <w:rPr>
+            <w:rStyle w:val="Hyperlink"/>
+          </w:rPr>
+          <w:t>Vecteezy.com</w:t>
+        </w:r>
+      </w:hyperlink>
+      <w:r>
+        <w:t xml:space="preserve"> – free license with the required attribution</w:t>
+      </w:r>
+      <w:r>
+        <w:t xml:space="preserve"> – need to update fig 1 to show new ants</w:t>
+      </w:r>
+    </w:p>
+    <w:p>
+      <w:r>
+        <w:t xml:space="preserve">Inspired by this video </w:t>
+      </w:r>
+      <w:hyperlink r:id="rId8" w:history="1">
+        <w:r>
+          <w:rPr>
+            <w:rStyle w:val="Hyperlink"/>
+          </w:rPr>
+          <w:t>https://youtu.be/hTHpEF_jcu4</w:t>
+        </w:r>
+      </w:hyperlink>
+      <w:r>
+        <w:t xml:space="preserve"> </w:t>
+      </w:r>
+    </w:p>
+    <w:p>
+      <w:r>
+        <w:t xml:space="preserve">Unity NavMesh </w:t>
+      </w:r>
+      <w:hyperlink r:id="rId9" w:history="1">
+        <w:r>
+          <w:rPr>
+            <w:rStyle w:val="Hyperlink"/>
+          </w:rPr>
+          <w:t>https://youtu.be/G9Otw12OUvE</w:t>
+        </w:r>
+      </w:hyperlink>
+    </w:p>
+    <w:p/>
+    <w:p>
       <w:pPr>
         <w:pStyle w:val="Heading2"/>
       </w:pPr>
@@ -886,7 +1113,7 @@
       </w:r>
     </w:p>
     <w:p>
-      <w:hyperlink r:id="rId6" w:history="1">
+      <w:hyperlink r:id="rId10" w:history="1">
         <w:r>
           <w:rPr>
             <w:rStyle w:val="Hyperlink"/>
@@ -902,7 +1129,7 @@
       </w:r>
     </w:p>
     <w:p>
-      <w:hyperlink r:id="rId7" w:history="1">
+      <w:hyperlink r:id="rId11" w:history="1">
         <w:r>
           <w:rPr>
             <w:rStyle w:val="Hyperlink"/>
@@ -924,7 +1151,7 @@
       </w:r>
     </w:p>
     <w:p>
-      <w:hyperlink r:id="rId8" w:history="1">
+      <w:hyperlink r:id="rId12" w:history="1">
         <w:r>
           <w:rPr>
             <w:rStyle w:val="Hyperlink"/>
@@ -940,7 +1167,7 @@
       </w:r>
     </w:p>
     <w:p>
-      <w:hyperlink r:id="rId9" w:tgtFrame="_blank" w:tooltip="https://pmc.ncbi.nlm.nih.gov/articles/pmc261877/" w:history="1">
+      <w:hyperlink r:id="rId13" w:tgtFrame="_blank" w:tooltip="https://pmc.ncbi.nlm.nih.gov/articles/pmc261877/" w:history="1">
         <w:r>
           <w:rPr>
             <w:rStyle w:val="Hyperlink"/>
@@ -956,7 +1183,7 @@
       </w:r>
     </w:p>
     <w:p>
-      <w:hyperlink r:id="rId10" w:history="1">
+      <w:hyperlink r:id="rId14" w:history="1">
         <w:r>
           <w:rPr>
             <w:rStyle w:val="Hyperlink"/>
@@ -971,11 +1198,12 @@
     <w:p/>
     <w:p>
       <w:r>
+        <w:lastRenderedPageBreak/>
         <w:t>Ants might need to follow return trail</w:t>
       </w:r>
     </w:p>
     <w:p>
-      <w:hyperlink r:id="rId11" w:history="1">
+      <w:hyperlink r:id="rId15" w:history="1">
         <w:r>
           <w:rPr>
             <w:rStyle w:val="Hyperlink"/>
@@ -994,7 +1222,7 @@
       </w:r>
     </w:p>
     <w:p>
-      <w:hyperlink r:id="rId12" w:history="1">
+      <w:hyperlink r:id="rId16" w:history="1">
         <w:r>
           <w:rPr>
             <w:rStyle w:val="Hyperlink"/>
@@ -1007,6 +1235,7 @@
       </w:r>
     </w:p>
     <w:p/>
+    <w:p/>
     <w:p>
       <w:pPr>
         <w:pStyle w:val="ListParagraph"/>
@@ -1030,23 +1259,6 @@
       <w:r>
         <w:t>Look at what has been done – what makes mine different</w:t>
       </w:r>
-    </w:p>
-    <w:p>
-      <w:pPr>
-        <w:pStyle w:val="ListParagraph"/>
-        <w:numPr>
-          <w:ilvl w:val="0"/>
-          <w:numId w:val="4"/>
-        </w:numPr>
-      </w:pPr>
-      <w:r>
-        <w:t>How to model ants (background)</w:t>
-      </w:r>
-    </w:p>
-    <w:p>
-      <w:pPr>
-        <w:pStyle w:val="ListParagraph"/>
-      </w:pPr>
     </w:p>
     <w:sectPr>
       <w:pgSz w:w="11906" w:h="16838"/>

</xml_diff>